<commit_message>
new: add pub-pvt unreachability in NAT proof
</commit_message>
<xml_diff>
--- a/networking-assessment/week_3-module-6.docx
+++ b/networking-assessment/week_3-module-6.docx
@@ -4070,8 +4070,73 @@
         </w:drawing>
       </w:r>
     </w:p>
+    <w:p>
+      <w:pPr>
+        <w:rPr>
+          <w:rFonts w:ascii="Arial" w:hAnsi="Arial" w:cs="Arial"/>
+          <w:noProof/>
+        </w:rPr>
+      </w:pPr>
+      <w:r>
+        <w:rPr>
+          <w:rFonts w:ascii="Arial" w:hAnsi="Arial" w:cs="Arial"/>
+          <w:noProof/>
+        </w:rPr>
+        <w:lastRenderedPageBreak/>
+        <w:t>We can also find that the server cabn never access the PC’s in private network with their private IP.</w:t>
+      </w:r>
+    </w:p>
+    <w:p>
+      <w:pPr>
+        <w:rPr>
+          <w:rFonts w:ascii="Arial" w:hAnsi="Arial" w:cs="Arial"/>
+          <w:noProof/>
+        </w:rPr>
+      </w:pPr>
+      <w:r>
+        <w:rPr>
+          <w:rFonts w:ascii="Arial" w:hAnsi="Arial" w:cs="Arial"/>
+          <w:noProof/>
+        </w:rPr>
+        <w:drawing>
+          <wp:inline distT="0" distB="0" distL="0" distR="0" wp14:anchorId="2B2B6438" wp14:editId="5A3BC4AA">
+            <wp:extent cx="6530340" cy="3119755"/>
+            <wp:effectExtent l="0" t="0" r="3810" b="4445"/>
+            <wp:docPr id="1960510147" name="Picture 1"/>
+            <wp:cNvGraphicFramePr>
+              <a:graphicFrameLocks xmlns:a="http://schemas.openxmlformats.org/drawingml/2006/main" noChangeAspect="1"/>
+            </wp:cNvGraphicFramePr>
+            <a:graphic xmlns:a="http://schemas.openxmlformats.org/drawingml/2006/main">
+              <a:graphicData uri="http://schemas.openxmlformats.org/drawingml/2006/picture">
+                <pic:pic xmlns:pic="http://schemas.openxmlformats.org/drawingml/2006/picture">
+                  <pic:nvPicPr>
+                    <pic:cNvPr id="1960510147" name=""/>
+                    <pic:cNvPicPr/>
+                  </pic:nvPicPr>
+                  <pic:blipFill>
+                    <a:blip r:embed="rId22"/>
+                    <a:stretch>
+                      <a:fillRect/>
+                    </a:stretch>
+                  </pic:blipFill>
+                  <pic:spPr>
+                    <a:xfrm>
+                      <a:off x="0" y="0"/>
+                      <a:ext cx="6530340" cy="3119755"/>
+                    </a:xfrm>
+                    <a:prstGeom prst="rect">
+                      <a:avLst/>
+                    </a:prstGeom>
+                  </pic:spPr>
+                </pic:pic>
+              </a:graphicData>
+            </a:graphic>
+          </wp:inline>
+        </w:drawing>
+      </w:r>
+    </w:p>
     <w:sectPr>
-      <w:headerReference w:type="default" r:id="rId22"/>
+      <w:headerReference w:type="default" r:id="rId23"/>
       <w:pgSz w:w="11906" w:h="16838" w:code="9"/>
       <w:pgMar w:top="1077" w:right="811" w:bottom="1077" w:left="811" w:header="709" w:footer="709" w:gutter="0"/>
       <w:pgBorders w:offsetFrom="page">

</xml_diff>